<commit_message>
docs(ch1): rename Statistical AI component to Class Performance Analytics
Renamed throughout Chapter 1 Master (Introduction, Project Context, Purpose, Statement of the Problem, Significance, Scope). Feature does aggregation/reporting on already-scored data, not model-based inference, so it shouldn't be labeled a second AI component alongside the NLP scorer.
</commit_message>
<xml_diff>
--- a/01_THESIS/Chapter 1/Chapter 1 Master.docx
+++ b/01_THESIS/Chapter 1/Chapter 1 Master.docx
@@ -1026,7 +1026,31 @@
           <w:sz w:val="24"/>
           <w:szCs w:val="24"/>
         </w:rPr>
-        <w:t>two AI-assisted components: an NLP AI component that evaluates written responses, particularly essays and short-answer responses, with essay evaluation as its main highlighted capability, and a Statistical AI component that analyzes aggregated assessment results, such as class averages and score distributions, to produce classroom-level insights for teachers (</w:t>
+        <w:t xml:space="preserve">two AI-assisted components: an NLP AI component that evaluates written responses, particularly essays and short-answer responses, with essay evaluation as its main highlighted capability, </w:t>
+      </w:r>
+      <w:r>
+        <w:rPr>
+          <w:rFonts w:ascii="Times New Roman" w:hAnsi="Times New Roman" w:cs="Times New Roman"/>
+          <w:sz w:val="24"/>
+          <w:szCs w:val="24"/>
+        </w:rPr>
+        <w:t>and a Class Performance Analytics component that summarizes aggregated assessment results, such as class averages and score distributions, to produce classroom-level insights for teachers</w:t>
+      </w:r>
+      <w:r>
+        <w:rPr>
+          <w:rFonts w:ascii="Times New Roman" w:hAnsi="Times New Roman" w:cs="Times New Roman"/>
+          <w:sz w:val="24"/>
+          <w:szCs w:val="24"/>
+        </w:rPr>
+        <w:t xml:space="preserve"> </w:t>
+      </w:r>
+      <w:r>
+        <w:rPr>
+          <w:rFonts w:ascii="Times New Roman" w:hAnsi="Times New Roman" w:cs="Times New Roman"/>
+          <w:sz w:val="24"/>
+          <w:szCs w:val="24"/>
+        </w:rPr>
+        <w:t>(</w:t>
       </w:r>
       <w:proofErr w:type="spellStart"/>
       <w:r>
@@ -1152,7 +1176,42 @@
           <w:sz w:val="24"/>
           <w:szCs w:val="24"/>
         </w:rPr>
-        <w:t>At a conceptual level, the proposed system is composed of two AI-assisted components working together with a structured database. The NLP AI component accepts a student's written response, submitted through a teacher-facing web application, and generates a predicted score together with brief accompanying feedback, which the teacher may then review. The Statistical AI component instead works on aggregated data already stored in the system, such as scores across a class or a specific question, and produces summarized insights such as average performance, score distributions, and areas where students performed well or experienced difficulty. Objective-item results are checked through answer-key comparison and are likewise stored for inclusion in these aggregated insights.</w:t>
+        <w:t xml:space="preserve">At a conceptual level, </w:t>
+      </w:r>
+      <w:r>
+        <w:rPr>
+          <w:rFonts w:ascii="Times New Roman" w:hAnsi="Times New Roman" w:cs="Times New Roman"/>
+          <w:sz w:val="24"/>
+          <w:szCs w:val="24"/>
+        </w:rPr>
+        <w:t>the proposed system is composed of an NLP AI component and a supporting Class Performance Analytics component, working together with a structured database. The NLP AI component accepts a student's written response</w:t>
+      </w:r>
+      <w:r>
+        <w:rPr>
+          <w:rFonts w:ascii="Times New Roman" w:hAnsi="Times New Roman" w:cs="Times New Roman"/>
+          <w:sz w:val="24"/>
+          <w:szCs w:val="24"/>
+        </w:rPr>
+        <w:t>, submitted through a teacher-facing web application, and generates a predicted score together with brief accompanying feedback, which the teacher may then review.</w:t>
+      </w:r>
+      <w:r>
+        <w:t xml:space="preserve"> </w:t>
+      </w:r>
+      <w:r>
+        <w:rPr>
+          <w:rFonts w:ascii="Times New Roman" w:hAnsi="Times New Roman" w:cs="Times New Roman"/>
+          <w:sz w:val="24"/>
+          <w:szCs w:val="24"/>
+        </w:rPr>
+        <w:t>The Class Performance Analytics component instead works on aggregated data already stored in the system</w:t>
+      </w:r>
+      <w:r>
+        <w:rPr>
+          <w:rFonts w:ascii="Times New Roman" w:hAnsi="Times New Roman" w:cs="Times New Roman"/>
+          <w:sz w:val="24"/>
+          <w:szCs w:val="24"/>
+        </w:rPr>
+        <w:t>, such as scores across a class or a specific question, and produces summarized insights such as average performance, score distributions, and areas where students performed well or experienced difficulty. Objective-item results are checked through answer-key comparison and are likewise stored for inclusion in these aggregated insights.</w:t>
       </w:r>
     </w:p>
     <w:p>
@@ -1192,7 +1251,7 @@
           <w:sz w:val="24"/>
           <w:szCs w:val="24"/>
         </w:rPr>
-        <w:t xml:space="preserve">Overall, this study is expected to contribute to education by providing a tool that reduces the time and effort required to check student assessments while giving teachers a clearer, consolidated view of how their class is performing. The system is intended to assist rather than replace teachers in the evaluation process; every AI-generated score for a written </w:t>
+        <w:t xml:space="preserve">Overall, this study is expected to contribute to education by providing a tool that reduces the time and effort required to check student assessments while giving teachers a clearer, consolidated view of how their class is performing. The system is intended to assist </w:t>
       </w:r>
       <w:r>
         <w:rPr>
@@ -1201,7 +1260,7 @@
           <w:szCs w:val="24"/>
         </w:rPr>
         <w:lastRenderedPageBreak/>
-        <w:t>response can be reviewed and, where supported by the approved system design, overridden by a teacher before it is treated as final, consistent with the principle that automated checking should be paired with human oversight (Yang et al., 2024).</w:t>
+        <w:t>rather than replace teachers in the evaluation process; every AI-generated score for a written response can be reviewed and, where supported by the approved system design, overridden by a teacher before it is treated as final, consistent with the principle that automated checking should be paired with human oversight (Yang et al., 2024).</w:t>
       </w:r>
     </w:p>
     <w:p>
@@ -1262,7 +1321,31 @@
           <w:sz w:val="24"/>
           <w:szCs w:val="24"/>
         </w:rPr>
-        <w:t>, 2022). This difficulty affects the efficiency, consistency, and usefulness of assessment checking, particularly for essay and short-answer responses. To address this problem, this study proposes the development of an AI-Assisted Assessment Checker that evaluates written responses using an NLP-based component, checks objective items through answer-key comparison, and analyzes aggregated results through a statistical component to support teachers.</w:t>
+        <w:t>, 2022). This difficulty affects the efficiency, consistency, and usefulness of assessment checking, particularly for essay and short-answer responses. To address this problem, this study proposes the development of an AI-Assisted Assessment Checker that evaluates written responses using an NLP-based component, checks objective items through answer-key comparison, and</w:t>
+      </w:r>
+      <w:r>
+        <w:rPr>
+          <w:rFonts w:ascii="Times New Roman" w:hAnsi="Times New Roman" w:cs="Times New Roman"/>
+          <w:sz w:val="24"/>
+          <w:szCs w:val="24"/>
+        </w:rPr>
+        <w:t xml:space="preserve"> </w:t>
+      </w:r>
+      <w:r>
+        <w:rPr>
+          <w:rFonts w:ascii="Times New Roman" w:hAnsi="Times New Roman" w:cs="Times New Roman"/>
+          <w:sz w:val="24"/>
+          <w:szCs w:val="24"/>
+        </w:rPr>
+        <w:t>consolidates aggregated results through a class performance analytics component to support teachers</w:t>
+      </w:r>
+      <w:r>
+        <w:rPr>
+          <w:rFonts w:ascii="Times New Roman" w:hAnsi="Times New Roman" w:cs="Times New Roman"/>
+          <w:sz w:val="24"/>
+          <w:szCs w:val="24"/>
+        </w:rPr>
+        <w:t>.</w:t>
       </w:r>
     </w:p>
     <w:p>
@@ -1562,7 +1645,23 @@
           <w:sz w:val="24"/>
           <w:szCs w:val="24"/>
         </w:rPr>
-        <w:t>For the researchers and developers involved in this project, the study provides an opportunity to gain practical experience in integrating NLP-based evaluation with statistical analysis in a single educational assessment system. Through the process of designing, building, and evaluating both AI components, the researchers are expected to develop a deeper understanding of how these two types of AI can be applied together to a real-world assessment problem.</w:t>
+        <w:t xml:space="preserve">For the researchers and developers involved in this project, the study provides an opportunity to gain practical experience in integrating NLP-based evaluation with statistical analysis in a single educational assessment system. Through the process of designing, building, and </w:t>
+      </w:r>
+      <w:r>
+        <w:rPr>
+          <w:rFonts w:ascii="Times New Roman" w:hAnsi="Times New Roman" w:cs="Times New Roman"/>
+          <w:sz w:val="24"/>
+          <w:szCs w:val="24"/>
+        </w:rPr>
+        <w:t>evaluating the NLP scoring component alongside the analytics component, the researchers are expected to develop a deeper understanding of how AI-based scoring and data analytics can be applied together to a real-world assessment problem</w:t>
+      </w:r>
+      <w:r>
+        <w:rPr>
+          <w:rFonts w:ascii="Times New Roman" w:hAnsi="Times New Roman" w:cs="Times New Roman"/>
+          <w:sz w:val="24"/>
+          <w:szCs w:val="24"/>
+        </w:rPr>
+        <w:t>.</w:t>
       </w:r>
     </w:p>
     <w:p>
@@ -1625,7 +1724,31 @@
           <w:sz w:val="24"/>
           <w:szCs w:val="24"/>
         </w:rPr>
-        <w:t xml:space="preserve">This study is scoped to the design and development of an AI-Assisted Assessment Checker composed of two AI-assisted components: an NLP AI component that evaluates written responses, and a Statistical AI component that analyzes aggregated assessment results. Essay evaluation is the primary and most highlighted capability of the NLP component, with short-answer evaluation also supported as part of the same written-response evaluation function. Objective assessments, such as multiple-choice or true/false items, are checked through conventional answer-key comparison rather than through either AI </w:t>
+        <w:t xml:space="preserve">This study is scoped to the design and development of an AI-Assisted Assessment Checker </w:t>
+      </w:r>
+      <w:r>
+        <w:rPr>
+          <w:rFonts w:ascii="Times New Roman" w:hAnsi="Times New Roman" w:cs="Times New Roman"/>
+          <w:sz w:val="24"/>
+          <w:szCs w:val="24"/>
+        </w:rPr>
+        <w:t>composed of an NLP AI component that evaluates written responses, paired with a Class Performance Analytics component that summarizes aggregated assessment results</w:t>
+      </w:r>
+      <w:r>
+        <w:rPr>
+          <w:rFonts w:ascii="Times New Roman" w:hAnsi="Times New Roman" w:cs="Times New Roman"/>
+          <w:sz w:val="24"/>
+          <w:szCs w:val="24"/>
+        </w:rPr>
+        <w:t xml:space="preserve">. Essay evaluation is the primary and most highlighted capability of the NLP component, with short-answer evaluation also supported as part of the same written-response evaluation function. Objective assessments, such as multiple-choice or true/false items, are checked through conventional answer-key comparison </w:t>
+      </w:r>
+      <w:r>
+        <w:rPr>
+          <w:rFonts w:ascii="Times New Roman" w:hAnsi="Times New Roman" w:cs="Times New Roman"/>
+          <w:sz w:val="24"/>
+          <w:szCs w:val="24"/>
+        </w:rPr>
+        <w:t xml:space="preserve">rather than through the NLP component, </w:t>
       </w:r>
       <w:r>
         <w:rPr>
@@ -1634,7 +1757,15 @@
           <w:szCs w:val="24"/>
         </w:rPr>
         <w:lastRenderedPageBreak/>
-        <w:t>component, though their results may still be included in the statistical analysis. The intended users of the system are teachers and instructors, with the potential to extend its benefits to educational institutions that choose to adopt it, either through a standalone, browser-based application or through a documented API that a school's existing Virtual Learning Environment (VLE) can call (Plasencia-Calaña, 2025).</w:t>
+        <w:t>though their results may still be included in the class performance analytics</w:t>
+      </w:r>
+      <w:r>
+        <w:rPr>
+          <w:rFonts w:ascii="Times New Roman" w:hAnsi="Times New Roman" w:cs="Times New Roman"/>
+          <w:sz w:val="24"/>
+          <w:szCs w:val="24"/>
+        </w:rPr>
+        <w:t>. The intended users of the system are teachers and instructors, with the potential to extend its benefits to educational institutions that choose to adopt it, either through a standalone, browser-based application or through a documented API that a school's existing Virtual Learning Environment (VLE) can call (Plasencia-Calaña, 2025).</w:t>
       </w:r>
     </w:p>
     <w:p>
@@ -1672,7 +1803,23 @@
           <w:sz w:val="24"/>
           <w:szCs w:val="24"/>
         </w:rPr>
-        <w:t xml:space="preserve"> model (Soumia et al., 2024); a Statistical AI component that computes class-level metrics such as average scores and score distributions from stored results; a teacher-facing review interface that allows an AI-generated score for a written response to be viewed and, when necessary, manually overridden before it is treated as final; and storage of submissions, scores, feedback, override records, and statistical summaries in a MySQL database. Optical character recognition (OCR) for handwritten responses and API integration with external platforms are treated as optional extensions rather than core features. Features not listed here, such as plagiarism detection or support for languages other than English, are not part of this study's planned implementation.</w:t>
+        <w:t xml:space="preserve"> model (Soumia et al., 2024); </w:t>
+      </w:r>
+      <w:r>
+        <w:rPr>
+          <w:rFonts w:ascii="Times New Roman" w:hAnsi="Times New Roman" w:cs="Times New Roman"/>
+          <w:sz w:val="24"/>
+          <w:szCs w:val="24"/>
+        </w:rPr>
+        <w:t>a Class Performance Analytics component that computes class-level metrics such as average scores and score distributions from stored results</w:t>
+      </w:r>
+      <w:r>
+        <w:rPr>
+          <w:rFonts w:ascii="Times New Roman" w:hAnsi="Times New Roman" w:cs="Times New Roman"/>
+          <w:sz w:val="24"/>
+          <w:szCs w:val="24"/>
+        </w:rPr>
+        <w:t>; a teacher-facing review interface that allows an AI-generated score for a written response to be viewed and, when necessary, manually overridden before it is treated as final; and storage of submissions, scores, feedback, override records, and statistical summaries in a MySQL database. Optical character recognition (OCR) for handwritten responses and API integration with external platforms are treated as optional extensions rather than core features. Features not listed here, such as plagiarism detection or support for languages other than English, are not part of this study's planned implementation.</w:t>
       </w:r>
     </w:p>
     <w:p>
@@ -1737,7 +1884,31 @@
           <w:sz w:val="24"/>
           <w:szCs w:val="24"/>
         </w:rPr>
-        <w:t xml:space="preserve"> et al., 2023). The Statistical AI component, in turn, is limited to analyzing the results already produced by the NLP component and the answer-key checking process; it does not independently re-evaluate the quality of any response.</w:t>
+        <w:t xml:space="preserve"> et al., 2023). </w:t>
+      </w:r>
+      <w:r>
+        <w:rPr>
+          <w:rFonts w:ascii="Times New Roman" w:hAnsi="Times New Roman" w:cs="Times New Roman"/>
+          <w:sz w:val="24"/>
+          <w:szCs w:val="24"/>
+        </w:rPr>
+        <w:t>The Class Performance Analytics component, in turn, is limited to summarizing the results already produced by the NLP component</w:t>
+      </w:r>
+      <w:r>
+        <w:rPr>
+          <w:rFonts w:ascii="Times New Roman" w:hAnsi="Times New Roman" w:cs="Times New Roman"/>
+          <w:sz w:val="24"/>
+          <w:szCs w:val="24"/>
+        </w:rPr>
+        <w:t xml:space="preserve"> </w:t>
+      </w:r>
+      <w:r>
+        <w:rPr>
+          <w:rFonts w:ascii="Times New Roman" w:hAnsi="Times New Roman" w:cs="Times New Roman"/>
+          <w:sz w:val="24"/>
+          <w:szCs w:val="24"/>
+        </w:rPr>
+        <w:t>and the answer-key checking process; it does not independently re-evaluate the quality of any response.</w:t>
       </w:r>
     </w:p>
     <w:p>

</xml_diff>